<commit_message>
feat: login system — JWT auth, register, login, user sessions
Server:
- POST /api/auth/register (username + password, bcrypt hashed)
- POST /api/auth/login (returns JWT token, 30d expiry)
- GET /api/auth/me (verify token, return user)
- authMiddleware for protected routes
- Users collection in JSON database

Frontend:
- login.html: username/password form, token storage
- register.html: create account, auto-login
- Header: shows avatar+username when logged in, logout button
- '👤 登录' link when not logged in (redirects to login.html)
- doLogout() clears token and user data
</commit_message>
<xml_diff>
--- a/PRD-Journey-V1.0.docx
+++ b/PRD-Journey-V1.0.docx
@@ -97,8 +97,6 @@
           <w:sz w:val="24"/>
         </w:rPr>
       </w:pPr>
-      <w:bookmarkStart w:id="76" w:name="_GoBack"/>
-      <w:bookmarkEnd w:id="76"/>
     </w:p>
     <w:p>
       <w:pPr>
@@ -239,12 +237,13 @@
         <w:jc w:val="left"/>
         <w:textAlignment w:val="auto"/>
         <w:rPr>
-          <w:rFonts w:ascii="Segoe UI" w:hAnsi="Segoe UI" w:eastAsia="微软雅黑"/>
+          <w:rFonts w:hint="default" w:ascii="Segoe UI" w:hAnsi="Segoe UI" w:eastAsia="微软雅黑"/>
           <w:b/>
           <w:bCs/>
           <w:color w:val="auto"/>
           <w:sz w:val="32"/>
           <w:szCs w:val="40"/>
+          <w:lang w:val="en-US" w:eastAsia="zh-CN"/>
         </w:rPr>
       </w:pPr>
       <w:r>
@@ -258,6 +257,20 @@
         </w:rPr>
         <w:t>目标平台　</w:t>
       </w:r>
+      <w:r>
+        <w:rPr>
+          <w:rFonts w:hint="eastAsia"/>
+          <w:b/>
+          <w:bCs/>
+          <w:color w:val="auto"/>
+          <w:sz w:val="32"/>
+          <w:szCs w:val="40"/>
+          <w:lang w:val="en-US" w:eastAsia="zh-CN"/>
+        </w:rPr>
+        <w:t>Web APP</w:t>
+      </w:r>
+      <w:bookmarkStart w:id="76" w:name="_GoBack"/>
+      <w:bookmarkEnd w:id="76"/>
     </w:p>
     <w:p>
       <w:r>
@@ -545,6 +558,14 @@
           <w:docPartUnique/>
         </w:docPartObj>
       </w:sdtPr>
+      <w:sdtEndPr>
+        <w:rPr>
+          <w:rFonts w:ascii="宋体" w:hAnsi="宋体" w:eastAsia="宋体" w:cstheme="minorBidi"/>
+          <w:sz w:val="21"/>
+          <w:szCs w:val="22"/>
+          <w:lang w:val="en-US" w:eastAsia="en-US" w:bidi="ar-SA"/>
+        </w:rPr>
+      </w:sdtEndPr>
       <w:sdtContent>
         <w:p>
           <w:pPr>
@@ -23902,6 +23923,12 @@
             <w:insideH w:val="single" w:color="DDE3EC" w:sz="4" w:space="0"/>
             <w:insideV w:val="single" w:color="DDE3EC" w:sz="4" w:space="0"/>
           </w:tblBorders>
+          <w:tblCellMar>
+            <w:top w:w="0" w:type="dxa"/>
+            <w:left w:w="108" w:type="dxa"/>
+            <w:bottom w:w="0" w:type="dxa"/>
+            <w:right w:w="108" w:type="dxa"/>
+          </w:tblCellMar>
         </w:tblPrEx>
         <w:trPr>
           <w:jc w:val="center"/>
@@ -25513,6 +25540,12 @@
             <w:insideH w:val="single" w:color="DDE3EC" w:sz="4" w:space="0"/>
             <w:insideV w:val="single" w:color="DDE3EC" w:sz="4" w:space="0"/>
           </w:tblBorders>
+          <w:tblCellMar>
+            <w:top w:w="0" w:type="dxa"/>
+            <w:left w:w="108" w:type="dxa"/>
+            <w:bottom w:w="0" w:type="dxa"/>
+            <w:right w:w="108" w:type="dxa"/>
+          </w:tblCellMar>
         </w:tblPrEx>
         <w:trPr>
           <w:jc w:val="center"/>
@@ -32073,9 +32106,9 @@
     <w:lsdException w:uiPriority="99" w:name="index 7"/>
     <w:lsdException w:uiPriority="99" w:name="index 8"/>
     <w:lsdException w:uiPriority="99" w:name="index 9"/>
-    <w:lsdException w:uiPriority="39" w:name="toc 1"/>
-    <w:lsdException w:uiPriority="39" w:name="toc 2"/>
-    <w:lsdException w:uiPriority="39" w:name="toc 3"/>
+    <w:lsdException w:qFormat="1" w:uiPriority="39" w:name="toc 1"/>
+    <w:lsdException w:qFormat="1" w:uiPriority="39" w:name="toc 2"/>
+    <w:lsdException w:qFormat="1" w:uiPriority="39" w:name="toc 3"/>
     <w:lsdException w:uiPriority="39" w:name="toc 4"/>
     <w:lsdException w:uiPriority="39" w:name="toc 5"/>
     <w:lsdException w:uiPriority="39" w:name="toc 6"/>
@@ -32085,8 +32118,8 @@
     <w:lsdException w:uiPriority="99" w:name="Normal Indent"/>
     <w:lsdException w:uiPriority="99" w:name="footnote text"/>
     <w:lsdException w:uiPriority="99" w:name="annotation text"/>
-    <w:lsdException w:uiPriority="99" w:semiHidden="0" w:name="header"/>
-    <w:lsdException w:uiPriority="99" w:semiHidden="0" w:name="footer"/>
+    <w:lsdException w:qFormat="1" w:uiPriority="99" w:semiHidden="0" w:name="header"/>
+    <w:lsdException w:qFormat="1" w:uiPriority="99" w:semiHidden="0" w:name="footer"/>
     <w:lsdException w:uiPriority="99" w:name="index heading"/>
     <w:lsdException w:qFormat="1" w:uiPriority="35" w:name="caption"/>
     <w:lsdException w:uiPriority="99" w:name="table of figures"/>
@@ -32101,19 +32134,19 @@
     <w:lsdException w:uiPriority="99" w:name="table of authorities"/>
     <w:lsdException w:uiPriority="99" w:semiHidden="0" w:name="macro"/>
     <w:lsdException w:uiPriority="99" w:name="toa heading"/>
-    <w:lsdException w:uiPriority="99" w:semiHidden="0" w:name="List"/>
+    <w:lsdException w:qFormat="1" w:uiPriority="99" w:semiHidden="0" w:name="List"/>
     <w:lsdException w:uiPriority="99" w:semiHidden="0" w:name="List Bullet"/>
     <w:lsdException w:uiPriority="99" w:semiHidden="0" w:name="List Number"/>
     <w:lsdException w:qFormat="1" w:uiPriority="99" w:semiHidden="0" w:name="List 2"/>
-    <w:lsdException w:uiPriority="99" w:semiHidden="0" w:name="List 3"/>
+    <w:lsdException w:qFormat="1" w:uiPriority="99" w:semiHidden="0" w:name="List 3"/>
     <w:lsdException w:uiPriority="99" w:name="List 4"/>
     <w:lsdException w:uiPriority="99" w:name="List 5"/>
-    <w:lsdException w:uiPriority="99" w:semiHidden="0" w:name="List Bullet 2"/>
-    <w:lsdException w:uiPriority="99" w:semiHidden="0" w:name="List Bullet 3"/>
+    <w:lsdException w:qFormat="1" w:uiPriority="99" w:semiHidden="0" w:name="List Bullet 2"/>
+    <w:lsdException w:qFormat="1" w:uiPriority="99" w:semiHidden="0" w:name="List Bullet 3"/>
     <w:lsdException w:uiPriority="99" w:name="List Bullet 4"/>
     <w:lsdException w:uiPriority="99" w:name="List Bullet 5"/>
     <w:lsdException w:uiPriority="99" w:semiHidden="0" w:name="List Number 2"/>
-    <w:lsdException w:uiPriority="99" w:semiHidden="0" w:name="List Number 3"/>
+    <w:lsdException w:qFormat="1" w:uiPriority="99" w:semiHidden="0" w:name="List Number 3"/>
     <w:lsdException w:uiPriority="99" w:name="List Number 4"/>
     <w:lsdException w:uiPriority="99" w:name="List Number 5"/>
     <w:lsdException w:qFormat="1" w:unhideWhenUsed="0" w:uiPriority="10" w:semiHidden="0" w:name="Title"/>
@@ -32122,9 +32155,9 @@
     <w:lsdException w:uiPriority="1" w:name="Default Paragraph Font"/>
     <w:lsdException w:qFormat="1" w:uiPriority="99" w:semiHidden="0" w:name="Body Text"/>
     <w:lsdException w:uiPriority="99" w:name="Body Text Indent"/>
-    <w:lsdException w:uiPriority="99" w:semiHidden="0" w:name="List Continue"/>
-    <w:lsdException w:uiPriority="99" w:semiHidden="0" w:name="List Continue 2"/>
-    <w:lsdException w:uiPriority="99" w:semiHidden="0" w:name="List Continue 3"/>
+    <w:lsdException w:qFormat="1" w:uiPriority="99" w:semiHidden="0" w:name="List Continue"/>
+    <w:lsdException w:qFormat="1" w:uiPriority="99" w:semiHidden="0" w:name="List Continue 2"/>
+    <w:lsdException w:qFormat="1" w:uiPriority="99" w:semiHidden="0" w:name="List Continue 3"/>
     <w:lsdException w:uiPriority="99" w:name="List Continue 4"/>
     <w:lsdException w:uiPriority="99" w:name="List Continue 5"/>
     <w:lsdException w:uiPriority="99" w:name="Message Header"/>
@@ -32134,8 +32167,8 @@
     <w:lsdException w:uiPriority="99" w:name="Body Text First Indent"/>
     <w:lsdException w:uiPriority="99" w:name="Body Text First Indent 2"/>
     <w:lsdException w:uiPriority="99" w:name="Note Heading"/>
-    <w:lsdException w:uiPriority="99" w:semiHidden="0" w:name="Body Text 2"/>
-    <w:lsdException w:uiPriority="99" w:semiHidden="0" w:name="Body Text 3"/>
+    <w:lsdException w:qFormat="1" w:uiPriority="99" w:semiHidden="0" w:name="Body Text 2"/>
+    <w:lsdException w:qFormat="1" w:uiPriority="99" w:semiHidden="0" w:name="Body Text 3"/>
     <w:lsdException w:uiPriority="99" w:name="Body Text Indent 2"/>
     <w:lsdException w:uiPriority="99" w:name="Body Text Indent 3"/>
     <w:lsdException w:uiPriority="99" w:name="Block Text"/>
@@ -32157,7 +32190,7 @@
     <w:lsdException w:uiPriority="99" w:name="HTML Sample"/>
     <w:lsdException w:uiPriority="99" w:name="HTML Typewriter"/>
     <w:lsdException w:uiPriority="99" w:name="HTML Variable"/>
-    <w:lsdException w:uiPriority="99" w:name="Normal Table"/>
+    <w:lsdException w:qFormat="1" w:uiPriority="99" w:name="Normal Table"/>
     <w:lsdException w:uiPriority="99" w:name="annotation subject"/>
     <w:lsdException w:uiPriority="99" w:name="Table Simple 1"/>
     <w:lsdException w:uiPriority="99" w:name="Table Simple 2"/>
@@ -32202,110 +32235,110 @@
     <w:lsdException w:uiPriority="99" w:name="Table Web 2"/>
     <w:lsdException w:uiPriority="99" w:name="Table Web 3"/>
     <w:lsdException w:uiPriority="99" w:name="Balloon Text"/>
-    <w:lsdException w:unhideWhenUsed="0" w:uiPriority="59" w:semiHidden="0" w:name="Table Grid"/>
+    <w:lsdException w:qFormat="1" w:unhideWhenUsed="0" w:uiPriority="59" w:semiHidden="0" w:name="Table Grid"/>
     <w:lsdException w:uiPriority="99" w:name="Table Theme"/>
     <w:lsdException w:qFormat="1" w:unhideWhenUsed="0" w:uiPriority="1" w:semiHidden="0" w:name="No Spacing"/>
     <w:lsdException w:unhideWhenUsed="0" w:uiPriority="60" w:semiHidden="0" w:name="Light Shading"/>
-    <w:lsdException w:unhideWhenUsed="0" w:uiPriority="61" w:semiHidden="0" w:name="Light List"/>
-    <w:lsdException w:unhideWhenUsed="0" w:uiPriority="62" w:semiHidden="0" w:name="Light Grid"/>
-    <w:lsdException w:unhideWhenUsed="0" w:uiPriority="63" w:semiHidden="0" w:name="Medium Shading 1"/>
-    <w:lsdException w:unhideWhenUsed="0" w:uiPriority="64" w:semiHidden="0" w:name="Medium Shading 2"/>
-    <w:lsdException w:unhideWhenUsed="0" w:uiPriority="65" w:semiHidden="0" w:name="Medium List 1"/>
-    <w:lsdException w:unhideWhenUsed="0" w:uiPriority="66" w:semiHidden="0" w:name="Medium List 2"/>
-    <w:lsdException w:unhideWhenUsed="0" w:uiPriority="67" w:semiHidden="0" w:name="Medium Grid 1"/>
-    <w:lsdException w:unhideWhenUsed="0" w:uiPriority="68" w:semiHidden="0" w:name="Medium Grid 2"/>
-    <w:lsdException w:unhideWhenUsed="0" w:uiPriority="69" w:semiHidden="0" w:name="Medium Grid 3"/>
-    <w:lsdException w:unhideWhenUsed="0" w:uiPriority="70" w:semiHidden="0" w:name="Dark List"/>
-    <w:lsdException w:unhideWhenUsed="0" w:uiPriority="71" w:semiHidden="0" w:name="Colorful Shading"/>
+    <w:lsdException w:qFormat="1" w:unhideWhenUsed="0" w:uiPriority="61" w:semiHidden="0" w:name="Light List"/>
+    <w:lsdException w:qFormat="1" w:unhideWhenUsed="0" w:uiPriority="62" w:semiHidden="0" w:name="Light Grid"/>
+    <w:lsdException w:qFormat="1" w:unhideWhenUsed="0" w:uiPriority="63" w:semiHidden="0" w:name="Medium Shading 1"/>
+    <w:lsdException w:qFormat="1" w:unhideWhenUsed="0" w:uiPriority="64" w:semiHidden="0" w:name="Medium Shading 2"/>
+    <w:lsdException w:qFormat="1" w:unhideWhenUsed="0" w:uiPriority="65" w:semiHidden="0" w:name="Medium List 1"/>
+    <w:lsdException w:qFormat="1" w:unhideWhenUsed="0" w:uiPriority="66" w:semiHidden="0" w:name="Medium List 2"/>
+    <w:lsdException w:qFormat="1" w:unhideWhenUsed="0" w:uiPriority="67" w:semiHidden="0" w:name="Medium Grid 1"/>
+    <w:lsdException w:qFormat="1" w:unhideWhenUsed="0" w:uiPriority="68" w:semiHidden="0" w:name="Medium Grid 2"/>
+    <w:lsdException w:qFormat="1" w:unhideWhenUsed="0" w:uiPriority="69" w:semiHidden="0" w:name="Medium Grid 3"/>
+    <w:lsdException w:qFormat="1" w:unhideWhenUsed="0" w:uiPriority="70" w:semiHidden="0" w:name="Dark List"/>
+    <w:lsdException w:qFormat="1" w:unhideWhenUsed="0" w:uiPriority="71" w:semiHidden="0" w:name="Colorful Shading"/>
     <w:lsdException w:qFormat="1" w:unhideWhenUsed="0" w:uiPriority="72" w:semiHidden="0" w:name="Colorful List"/>
-    <w:lsdException w:unhideWhenUsed="0" w:uiPriority="73" w:semiHidden="0" w:name="Colorful Grid"/>
-    <w:lsdException w:unhideWhenUsed="0" w:uiPriority="60" w:semiHidden="0" w:name="Light Shading Accent 1"/>
-    <w:lsdException w:unhideWhenUsed="0" w:uiPriority="61" w:semiHidden="0" w:name="Light List Accent 1"/>
-    <w:lsdException w:unhideWhenUsed="0" w:uiPriority="62" w:semiHidden="0" w:name="Light Grid Accent 1"/>
+    <w:lsdException w:qFormat="1" w:unhideWhenUsed="0" w:uiPriority="73" w:semiHidden="0" w:name="Colorful Grid"/>
+    <w:lsdException w:qFormat="1" w:unhideWhenUsed="0" w:uiPriority="60" w:semiHidden="0" w:name="Light Shading Accent 1"/>
+    <w:lsdException w:qFormat="1" w:unhideWhenUsed="0" w:uiPriority="61" w:semiHidden="0" w:name="Light List Accent 1"/>
+    <w:lsdException w:qFormat="1" w:unhideWhenUsed="0" w:uiPriority="62" w:semiHidden="0" w:name="Light Grid Accent 1"/>
     <w:lsdException w:qFormat="1" w:unhideWhenUsed="0" w:uiPriority="63" w:semiHidden="0" w:name="Medium Shading 1 Accent 1"/>
-    <w:lsdException w:unhideWhenUsed="0" w:uiPriority="64" w:semiHidden="0" w:name="Medium Shading 2 Accent 1"/>
+    <w:lsdException w:qFormat="1" w:unhideWhenUsed="0" w:uiPriority="64" w:semiHidden="0" w:name="Medium Shading 2 Accent 1"/>
     <w:lsdException w:qFormat="1" w:unhideWhenUsed="0" w:uiPriority="65" w:semiHidden="0" w:name="Medium List 1 Accent 1"/>
     <w:lsdException w:qFormat="1" w:unhideWhenUsed="0" w:uiPriority="34" w:semiHidden="0" w:name="List Paragraph"/>
     <w:lsdException w:qFormat="1" w:unhideWhenUsed="0" w:uiPriority="29" w:semiHidden="0" w:name="Quote"/>
     <w:lsdException w:qFormat="1" w:unhideWhenUsed="0" w:uiPriority="30" w:semiHidden="0" w:name="Intense Quote"/>
-    <w:lsdException w:unhideWhenUsed="0" w:uiPriority="66" w:semiHidden="0" w:name="Medium List 2 Accent 1"/>
-    <w:lsdException w:unhideWhenUsed="0" w:uiPriority="67" w:semiHidden="0" w:name="Medium Grid 1 Accent 1"/>
-    <w:lsdException w:unhideWhenUsed="0" w:uiPriority="68" w:semiHidden="0" w:name="Medium Grid 2 Accent 1"/>
-    <w:lsdException w:unhideWhenUsed="0" w:uiPriority="69" w:semiHidden="0" w:name="Medium Grid 3 Accent 1"/>
-    <w:lsdException w:unhideWhenUsed="0" w:uiPriority="70" w:semiHidden="0" w:name="Dark List Accent 1"/>
-    <w:lsdException w:unhideWhenUsed="0" w:uiPriority="71" w:semiHidden="0" w:name="Colorful Shading Accent 1"/>
-    <w:lsdException w:unhideWhenUsed="0" w:uiPriority="72" w:semiHidden="0" w:name="Colorful List Accent 1"/>
-    <w:lsdException w:unhideWhenUsed="0" w:uiPriority="73" w:semiHidden="0" w:name="Colorful Grid Accent 1"/>
-    <w:lsdException w:unhideWhenUsed="0" w:uiPriority="60" w:semiHidden="0" w:name="Light Shading Accent 2"/>
-    <w:lsdException w:unhideWhenUsed="0" w:uiPriority="61" w:semiHidden="0" w:name="Light List Accent 2"/>
-    <w:lsdException w:unhideWhenUsed="0" w:uiPriority="62" w:semiHidden="0" w:name="Light Grid Accent 2"/>
-    <w:lsdException w:unhideWhenUsed="0" w:uiPriority="63" w:semiHidden="0" w:name="Medium Shading 1 Accent 2"/>
-    <w:lsdException w:unhideWhenUsed="0" w:uiPriority="64" w:semiHidden="0" w:name="Medium Shading 2 Accent 2"/>
-    <w:lsdException w:unhideWhenUsed="0" w:uiPriority="65" w:semiHidden="0" w:name="Medium List 1 Accent 2"/>
-    <w:lsdException w:unhideWhenUsed="0" w:uiPriority="66" w:semiHidden="0" w:name="Medium List 2 Accent 2"/>
-    <w:lsdException w:unhideWhenUsed="0" w:uiPriority="67" w:semiHidden="0" w:name="Medium Grid 1 Accent 2"/>
-    <w:lsdException w:unhideWhenUsed="0" w:uiPriority="68" w:semiHidden="0" w:name="Medium Grid 2 Accent 2"/>
-    <w:lsdException w:unhideWhenUsed="0" w:uiPriority="69" w:semiHidden="0" w:name="Medium Grid 3 Accent 2"/>
-    <w:lsdException w:unhideWhenUsed="0" w:uiPriority="70" w:semiHidden="0" w:name="Dark List Accent 2"/>
-    <w:lsdException w:unhideWhenUsed="0" w:uiPriority="71" w:semiHidden="0" w:name="Colorful Shading Accent 2"/>
-    <w:lsdException w:unhideWhenUsed="0" w:uiPriority="72" w:semiHidden="0" w:name="Colorful List Accent 2"/>
-    <w:lsdException w:unhideWhenUsed="0" w:uiPriority="73" w:semiHidden="0" w:name="Colorful Grid Accent 2"/>
-    <w:lsdException w:unhideWhenUsed="0" w:uiPriority="60" w:semiHidden="0" w:name="Light Shading Accent 3"/>
-    <w:lsdException w:unhideWhenUsed="0" w:uiPriority="61" w:semiHidden="0" w:name="Light List Accent 3"/>
-    <w:lsdException w:unhideWhenUsed="0" w:uiPriority="62" w:semiHidden="0" w:name="Light Grid Accent 3"/>
-    <w:lsdException w:unhideWhenUsed="0" w:uiPriority="63" w:semiHidden="0" w:name="Medium Shading 1 Accent 3"/>
+    <w:lsdException w:qFormat="1" w:unhideWhenUsed="0" w:uiPriority="66" w:semiHidden="0" w:name="Medium List 2 Accent 1"/>
+    <w:lsdException w:qFormat="1" w:unhideWhenUsed="0" w:uiPriority="67" w:semiHidden="0" w:name="Medium Grid 1 Accent 1"/>
+    <w:lsdException w:qFormat="1" w:unhideWhenUsed="0" w:uiPriority="68" w:semiHidden="0" w:name="Medium Grid 2 Accent 1"/>
+    <w:lsdException w:qFormat="1" w:unhideWhenUsed="0" w:uiPriority="69" w:semiHidden="0" w:name="Medium Grid 3 Accent 1"/>
+    <w:lsdException w:qFormat="1" w:unhideWhenUsed="0" w:uiPriority="70" w:semiHidden="0" w:name="Dark List Accent 1"/>
+    <w:lsdException w:qFormat="1" w:unhideWhenUsed="0" w:uiPriority="71" w:semiHidden="0" w:name="Colorful Shading Accent 1"/>
+    <w:lsdException w:qFormat="1" w:unhideWhenUsed="0" w:uiPriority="72" w:semiHidden="0" w:name="Colorful List Accent 1"/>
+    <w:lsdException w:qFormat="1" w:unhideWhenUsed="0" w:uiPriority="73" w:semiHidden="0" w:name="Colorful Grid Accent 1"/>
+    <w:lsdException w:qFormat="1" w:unhideWhenUsed="0" w:uiPriority="60" w:semiHidden="0" w:name="Light Shading Accent 2"/>
+    <w:lsdException w:qFormat="1" w:unhideWhenUsed="0" w:uiPriority="61" w:semiHidden="0" w:name="Light List Accent 2"/>
+    <w:lsdException w:qFormat="1" w:unhideWhenUsed="0" w:uiPriority="62" w:semiHidden="0" w:name="Light Grid Accent 2"/>
+    <w:lsdException w:qFormat="1" w:unhideWhenUsed="0" w:uiPriority="63" w:semiHidden="0" w:name="Medium Shading 1 Accent 2"/>
+    <w:lsdException w:qFormat="1" w:unhideWhenUsed="0" w:uiPriority="64" w:semiHidden="0" w:name="Medium Shading 2 Accent 2"/>
+    <w:lsdException w:qFormat="1" w:unhideWhenUsed="0" w:uiPriority="65" w:semiHidden="0" w:name="Medium List 1 Accent 2"/>
+    <w:lsdException w:qFormat="1" w:unhideWhenUsed="0" w:uiPriority="66" w:semiHidden="0" w:name="Medium List 2 Accent 2"/>
+    <w:lsdException w:qFormat="1" w:unhideWhenUsed="0" w:uiPriority="67" w:semiHidden="0" w:name="Medium Grid 1 Accent 2"/>
+    <w:lsdException w:qFormat="1" w:unhideWhenUsed="0" w:uiPriority="68" w:semiHidden="0" w:name="Medium Grid 2 Accent 2"/>
+    <w:lsdException w:qFormat="1" w:unhideWhenUsed="0" w:uiPriority="69" w:semiHidden="0" w:name="Medium Grid 3 Accent 2"/>
+    <w:lsdException w:qFormat="1" w:unhideWhenUsed="0" w:uiPriority="70" w:semiHidden="0" w:name="Dark List Accent 2"/>
+    <w:lsdException w:qFormat="1" w:unhideWhenUsed="0" w:uiPriority="71" w:semiHidden="0" w:name="Colorful Shading Accent 2"/>
+    <w:lsdException w:qFormat="1" w:unhideWhenUsed="0" w:uiPriority="72" w:semiHidden="0" w:name="Colorful List Accent 2"/>
+    <w:lsdException w:qFormat="1" w:unhideWhenUsed="0" w:uiPriority="73" w:semiHidden="0" w:name="Colorful Grid Accent 2"/>
+    <w:lsdException w:qFormat="1" w:unhideWhenUsed="0" w:uiPriority="60" w:semiHidden="0" w:name="Light Shading Accent 3"/>
+    <w:lsdException w:qFormat="1" w:unhideWhenUsed="0" w:uiPriority="61" w:semiHidden="0" w:name="Light List Accent 3"/>
+    <w:lsdException w:qFormat="1" w:unhideWhenUsed="0" w:uiPriority="62" w:semiHidden="0" w:name="Light Grid Accent 3"/>
+    <w:lsdException w:qFormat="1" w:unhideWhenUsed="0" w:uiPriority="63" w:semiHidden="0" w:name="Medium Shading 1 Accent 3"/>
     <w:lsdException w:qFormat="1" w:unhideWhenUsed="0" w:uiPriority="64" w:semiHidden="0" w:name="Medium Shading 2 Accent 3"/>
-    <w:lsdException w:unhideWhenUsed="0" w:uiPriority="65" w:semiHidden="0" w:name="Medium List 1 Accent 3"/>
-    <w:lsdException w:unhideWhenUsed="0" w:uiPriority="66" w:semiHidden="0" w:name="Medium List 2 Accent 3"/>
-    <w:lsdException w:unhideWhenUsed="0" w:uiPriority="67" w:semiHidden="0" w:name="Medium Grid 1 Accent 3"/>
-    <w:lsdException w:unhideWhenUsed="0" w:uiPriority="68" w:semiHidden="0" w:name="Medium Grid 2 Accent 3"/>
-    <w:lsdException w:unhideWhenUsed="0" w:uiPriority="69" w:semiHidden="0" w:name="Medium Grid 3 Accent 3"/>
-    <w:lsdException w:unhideWhenUsed="0" w:uiPriority="70" w:semiHidden="0" w:name="Dark List Accent 3"/>
-    <w:lsdException w:unhideWhenUsed="0" w:uiPriority="71" w:semiHidden="0" w:name="Colorful Shading Accent 3"/>
-    <w:lsdException w:unhideWhenUsed="0" w:uiPriority="72" w:semiHidden="0" w:name="Colorful List Accent 3"/>
-    <w:lsdException w:unhideWhenUsed="0" w:uiPriority="73" w:semiHidden="0" w:name="Colorful Grid Accent 3"/>
-    <w:lsdException w:unhideWhenUsed="0" w:uiPriority="60" w:semiHidden="0" w:name="Light Shading Accent 4"/>
-    <w:lsdException w:unhideWhenUsed="0" w:uiPriority="61" w:semiHidden="0" w:name="Light List Accent 4"/>
-    <w:lsdException w:unhideWhenUsed="0" w:uiPriority="62" w:semiHidden="0" w:name="Light Grid Accent 4"/>
-    <w:lsdException w:unhideWhenUsed="0" w:uiPriority="63" w:semiHidden="0" w:name="Medium Shading 1 Accent 4"/>
-    <w:lsdException w:unhideWhenUsed="0" w:uiPriority="64" w:semiHidden="0" w:name="Medium Shading 2 Accent 4"/>
-    <w:lsdException w:unhideWhenUsed="0" w:uiPriority="65" w:semiHidden="0" w:name="Medium List 1 Accent 4"/>
-    <w:lsdException w:unhideWhenUsed="0" w:uiPriority="66" w:semiHidden="0" w:name="Medium List 2 Accent 4"/>
-    <w:lsdException w:unhideWhenUsed="0" w:uiPriority="67" w:semiHidden="0" w:name="Medium Grid 1 Accent 4"/>
-    <w:lsdException w:unhideWhenUsed="0" w:uiPriority="68" w:semiHidden="0" w:name="Medium Grid 2 Accent 4"/>
-    <w:lsdException w:unhideWhenUsed="0" w:uiPriority="69" w:semiHidden="0" w:name="Medium Grid 3 Accent 4"/>
-    <w:lsdException w:unhideWhenUsed="0" w:uiPriority="70" w:semiHidden="0" w:name="Dark List Accent 4"/>
-    <w:lsdException w:unhideWhenUsed="0" w:uiPriority="71" w:semiHidden="0" w:name="Colorful Shading Accent 4"/>
-    <w:lsdException w:unhideWhenUsed="0" w:uiPriority="72" w:semiHidden="0" w:name="Colorful List Accent 4"/>
-    <w:lsdException w:unhideWhenUsed="0" w:uiPriority="73" w:semiHidden="0" w:name="Colorful Grid Accent 4"/>
-    <w:lsdException w:unhideWhenUsed="0" w:uiPriority="60" w:semiHidden="0" w:name="Light Shading Accent 5"/>
-    <w:lsdException w:unhideWhenUsed="0" w:uiPriority="61" w:semiHidden="0" w:name="Light List Accent 5"/>
-    <w:lsdException w:unhideWhenUsed="0" w:uiPriority="62" w:semiHidden="0" w:name="Light Grid Accent 5"/>
-    <w:lsdException w:unhideWhenUsed="0" w:uiPriority="63" w:semiHidden="0" w:name="Medium Shading 1 Accent 5"/>
-    <w:lsdException w:unhideWhenUsed="0" w:uiPriority="64" w:semiHidden="0" w:name="Medium Shading 2 Accent 5"/>
-    <w:lsdException w:unhideWhenUsed="0" w:uiPriority="65" w:semiHidden="0" w:name="Medium List 1 Accent 5"/>
-    <w:lsdException w:unhideWhenUsed="0" w:uiPriority="66" w:semiHidden="0" w:name="Medium List 2 Accent 5"/>
-    <w:lsdException w:unhideWhenUsed="0" w:uiPriority="67" w:semiHidden="0" w:name="Medium Grid 1 Accent 5"/>
-    <w:lsdException w:unhideWhenUsed="0" w:uiPriority="68" w:semiHidden="0" w:name="Medium Grid 2 Accent 5"/>
-    <w:lsdException w:unhideWhenUsed="0" w:uiPriority="69" w:semiHidden="0" w:name="Medium Grid 3 Accent 5"/>
-    <w:lsdException w:unhideWhenUsed="0" w:uiPriority="70" w:semiHidden="0" w:name="Dark List Accent 5"/>
-    <w:lsdException w:unhideWhenUsed="0" w:uiPriority="71" w:semiHidden="0" w:name="Colorful Shading Accent 5"/>
-    <w:lsdException w:unhideWhenUsed="0" w:uiPriority="72" w:semiHidden="0" w:name="Colorful List Accent 5"/>
-    <w:lsdException w:unhideWhenUsed="0" w:uiPriority="73" w:semiHidden="0" w:name="Colorful Grid Accent 5"/>
-    <w:lsdException w:unhideWhenUsed="0" w:uiPriority="60" w:semiHidden="0" w:name="Light Shading Accent 6"/>
-    <w:lsdException w:unhideWhenUsed="0" w:uiPriority="61" w:semiHidden="0" w:name="Light List Accent 6"/>
-    <w:lsdException w:unhideWhenUsed="0" w:uiPriority="62" w:semiHidden="0" w:name="Light Grid Accent 6"/>
-    <w:lsdException w:unhideWhenUsed="0" w:uiPriority="63" w:semiHidden="0" w:name="Medium Shading 1 Accent 6"/>
+    <w:lsdException w:qFormat="1" w:unhideWhenUsed="0" w:uiPriority="65" w:semiHidden="0" w:name="Medium List 1 Accent 3"/>
+    <w:lsdException w:qFormat="1" w:unhideWhenUsed="0" w:uiPriority="66" w:semiHidden="0" w:name="Medium List 2 Accent 3"/>
+    <w:lsdException w:qFormat="1" w:unhideWhenUsed="0" w:uiPriority="67" w:semiHidden="0" w:name="Medium Grid 1 Accent 3"/>
+    <w:lsdException w:qFormat="1" w:unhideWhenUsed="0" w:uiPriority="68" w:semiHidden="0" w:name="Medium Grid 2 Accent 3"/>
+    <w:lsdException w:qFormat="1" w:unhideWhenUsed="0" w:uiPriority="69" w:semiHidden="0" w:name="Medium Grid 3 Accent 3"/>
+    <w:lsdException w:qFormat="1" w:unhideWhenUsed="0" w:uiPriority="70" w:semiHidden="0" w:name="Dark List Accent 3"/>
+    <w:lsdException w:qFormat="1" w:unhideWhenUsed="0" w:uiPriority="71" w:semiHidden="0" w:name="Colorful Shading Accent 3"/>
+    <w:lsdException w:qFormat="1" w:unhideWhenUsed="0" w:uiPriority="72" w:semiHidden="0" w:name="Colorful List Accent 3"/>
+    <w:lsdException w:qFormat="1" w:unhideWhenUsed="0" w:uiPriority="73" w:semiHidden="0" w:name="Colorful Grid Accent 3"/>
+    <w:lsdException w:qFormat="1" w:unhideWhenUsed="0" w:uiPriority="60" w:semiHidden="0" w:name="Light Shading Accent 4"/>
+    <w:lsdException w:qFormat="1" w:unhideWhenUsed="0" w:uiPriority="61" w:semiHidden="0" w:name="Light List Accent 4"/>
+    <w:lsdException w:qFormat="1" w:unhideWhenUsed="0" w:uiPriority="62" w:semiHidden="0" w:name="Light Grid Accent 4"/>
+    <w:lsdException w:qFormat="1" w:unhideWhenUsed="0" w:uiPriority="63" w:semiHidden="0" w:name="Medium Shading 1 Accent 4"/>
+    <w:lsdException w:qFormat="1" w:unhideWhenUsed="0" w:uiPriority="64" w:semiHidden="0" w:name="Medium Shading 2 Accent 4"/>
+    <w:lsdException w:qFormat="1" w:unhideWhenUsed="0" w:uiPriority="65" w:semiHidden="0" w:name="Medium List 1 Accent 4"/>
+    <w:lsdException w:qFormat="1" w:unhideWhenUsed="0" w:uiPriority="66" w:semiHidden="0" w:name="Medium List 2 Accent 4"/>
+    <w:lsdException w:qFormat="1" w:unhideWhenUsed="0" w:uiPriority="67" w:semiHidden="0" w:name="Medium Grid 1 Accent 4"/>
+    <w:lsdException w:qFormat="1" w:unhideWhenUsed="0" w:uiPriority="68" w:semiHidden="0" w:name="Medium Grid 2 Accent 4"/>
+    <w:lsdException w:qFormat="1" w:unhideWhenUsed="0" w:uiPriority="69" w:semiHidden="0" w:name="Medium Grid 3 Accent 4"/>
+    <w:lsdException w:qFormat="1" w:unhideWhenUsed="0" w:uiPriority="70" w:semiHidden="0" w:name="Dark List Accent 4"/>
+    <w:lsdException w:qFormat="1" w:unhideWhenUsed="0" w:uiPriority="71" w:semiHidden="0" w:name="Colorful Shading Accent 4"/>
+    <w:lsdException w:qFormat="1" w:unhideWhenUsed="0" w:uiPriority="72" w:semiHidden="0" w:name="Colorful List Accent 4"/>
+    <w:lsdException w:qFormat="1" w:unhideWhenUsed="0" w:uiPriority="73" w:semiHidden="0" w:name="Colorful Grid Accent 4"/>
+    <w:lsdException w:qFormat="1" w:unhideWhenUsed="0" w:uiPriority="60" w:semiHidden="0" w:name="Light Shading Accent 5"/>
+    <w:lsdException w:qFormat="1" w:unhideWhenUsed="0" w:uiPriority="61" w:semiHidden="0" w:name="Light List Accent 5"/>
+    <w:lsdException w:qFormat="1" w:unhideWhenUsed="0" w:uiPriority="62" w:semiHidden="0" w:name="Light Grid Accent 5"/>
+    <w:lsdException w:qFormat="1" w:unhideWhenUsed="0" w:uiPriority="63" w:semiHidden="0" w:name="Medium Shading 1 Accent 5"/>
+    <w:lsdException w:qFormat="1" w:unhideWhenUsed="0" w:uiPriority="64" w:semiHidden="0" w:name="Medium Shading 2 Accent 5"/>
+    <w:lsdException w:qFormat="1" w:unhideWhenUsed="0" w:uiPriority="65" w:semiHidden="0" w:name="Medium List 1 Accent 5"/>
+    <w:lsdException w:qFormat="1" w:unhideWhenUsed="0" w:uiPriority="66" w:semiHidden="0" w:name="Medium List 2 Accent 5"/>
+    <w:lsdException w:qFormat="1" w:unhideWhenUsed="0" w:uiPriority="67" w:semiHidden="0" w:name="Medium Grid 1 Accent 5"/>
+    <w:lsdException w:qFormat="1" w:unhideWhenUsed="0" w:uiPriority="68" w:semiHidden="0" w:name="Medium Grid 2 Accent 5"/>
+    <w:lsdException w:qFormat="1" w:unhideWhenUsed="0" w:uiPriority="69" w:semiHidden="0" w:name="Medium Grid 3 Accent 5"/>
+    <w:lsdException w:qFormat="1" w:unhideWhenUsed="0" w:uiPriority="70" w:semiHidden="0" w:name="Dark List Accent 5"/>
+    <w:lsdException w:qFormat="1" w:unhideWhenUsed="0" w:uiPriority="71" w:semiHidden="0" w:name="Colorful Shading Accent 5"/>
+    <w:lsdException w:qFormat="1" w:unhideWhenUsed="0" w:uiPriority="72" w:semiHidden="0" w:name="Colorful List Accent 5"/>
+    <w:lsdException w:qFormat="1" w:unhideWhenUsed="0" w:uiPriority="73" w:semiHidden="0" w:name="Colorful Grid Accent 5"/>
+    <w:lsdException w:qFormat="1" w:unhideWhenUsed="0" w:uiPriority="60" w:semiHidden="0" w:name="Light Shading Accent 6"/>
+    <w:lsdException w:qFormat="1" w:unhideWhenUsed="0" w:uiPriority="61" w:semiHidden="0" w:name="Light List Accent 6"/>
+    <w:lsdException w:qFormat="1" w:unhideWhenUsed="0" w:uiPriority="62" w:semiHidden="0" w:name="Light Grid Accent 6"/>
+    <w:lsdException w:qFormat="1" w:unhideWhenUsed="0" w:uiPriority="63" w:semiHidden="0" w:name="Medium Shading 1 Accent 6"/>
     <w:lsdException w:qFormat="1" w:unhideWhenUsed="0" w:uiPriority="64" w:semiHidden="0" w:name="Medium Shading 2 Accent 6"/>
-    <w:lsdException w:unhideWhenUsed="0" w:uiPriority="65" w:semiHidden="0" w:name="Medium List 1 Accent 6"/>
-    <w:lsdException w:unhideWhenUsed="0" w:uiPriority="66" w:semiHidden="0" w:name="Medium List 2 Accent 6"/>
-    <w:lsdException w:unhideWhenUsed="0" w:uiPriority="67" w:semiHidden="0" w:name="Medium Grid 1 Accent 6"/>
-    <w:lsdException w:unhideWhenUsed="0" w:uiPriority="68" w:semiHidden="0" w:name="Medium Grid 2 Accent 6"/>
-    <w:lsdException w:unhideWhenUsed="0" w:uiPriority="69" w:semiHidden="0" w:name="Medium Grid 3 Accent 6"/>
-    <w:lsdException w:unhideWhenUsed="0" w:uiPriority="70" w:semiHidden="0" w:name="Dark List Accent 6"/>
-    <w:lsdException w:unhideWhenUsed="0" w:uiPriority="71" w:semiHidden="0" w:name="Colorful Shading Accent 6"/>
-    <w:lsdException w:unhideWhenUsed="0" w:uiPriority="72" w:semiHidden="0" w:name="Colorful List Accent 6"/>
-    <w:lsdException w:unhideWhenUsed="0" w:uiPriority="73" w:semiHidden="0" w:name="Colorful Grid Accent 6"/>
+    <w:lsdException w:qFormat="1" w:unhideWhenUsed="0" w:uiPriority="65" w:semiHidden="0" w:name="Medium List 1 Accent 6"/>
+    <w:lsdException w:qFormat="1" w:unhideWhenUsed="0" w:uiPriority="66" w:semiHidden="0" w:name="Medium List 2 Accent 6"/>
+    <w:lsdException w:qFormat="1" w:unhideWhenUsed="0" w:uiPriority="67" w:semiHidden="0" w:name="Medium Grid 1 Accent 6"/>
+    <w:lsdException w:qFormat="1" w:unhideWhenUsed="0" w:uiPriority="68" w:semiHidden="0" w:name="Medium Grid 2 Accent 6"/>
+    <w:lsdException w:qFormat="1" w:unhideWhenUsed="0" w:uiPriority="69" w:semiHidden="0" w:name="Medium Grid 3 Accent 6"/>
+    <w:lsdException w:qFormat="1" w:unhideWhenUsed="0" w:uiPriority="70" w:semiHidden="0" w:name="Dark List Accent 6"/>
+    <w:lsdException w:qFormat="1" w:unhideWhenUsed="0" w:uiPriority="71" w:semiHidden="0" w:name="Colorful Shading Accent 6"/>
+    <w:lsdException w:qFormat="1" w:unhideWhenUsed="0" w:uiPriority="72" w:semiHidden="0" w:name="Colorful List Accent 6"/>
+    <w:lsdException w:qFormat="1" w:unhideWhenUsed="0" w:uiPriority="73" w:semiHidden="0" w:name="Colorful Grid Accent 6"/>
   </w:latentStyles>
   <w:style w:type="paragraph" w:default="1" w:styleId="1">
     <w:name w:val="Normal"/>
@@ -32567,6 +32600,7 @@
     <w:name w:val="Normal Table"/>
     <w:semiHidden/>
     <w:unhideWhenUsed/>
+    <w:qFormat/>
     <w:uiPriority w:val="99"/>
     <w:tblPr>
       <w:tblCellMar>
@@ -32605,6 +32639,7 @@
     <w:name w:val="List 3"/>
     <w:basedOn w:val="1"/>
     <w:unhideWhenUsed/>
+    <w:qFormat/>
     <w:uiPriority w:val="99"/>
     <w:pPr>
       <w:ind w:left="1080" w:hanging="360"/>
@@ -32679,6 +32714,7 @@
     <w:basedOn w:val="1"/>
     <w:link w:val="149"/>
     <w:unhideWhenUsed/>
+    <w:qFormat/>
     <w:uiPriority w:val="99"/>
     <w:pPr>
       <w:spacing w:after="120"/>
@@ -32692,6 +32728,7 @@
     <w:name w:val="List Bullet 3"/>
     <w:basedOn w:val="1"/>
     <w:unhideWhenUsed/>
+    <w:qFormat/>
     <w:uiPriority w:val="99"/>
     <w:pPr>
       <w:numPr>
@@ -32716,6 +32753,7 @@
     <w:name w:val="List Number 3"/>
     <w:basedOn w:val="1"/>
     <w:unhideWhenUsed/>
+    <w:qFormat/>
     <w:uiPriority w:val="99"/>
     <w:pPr>
       <w:numPr>
@@ -32740,6 +32778,7 @@
     <w:name w:val="List Continue"/>
     <w:basedOn w:val="1"/>
     <w:unhideWhenUsed/>
+    <w:qFormat/>
     <w:uiPriority w:val="99"/>
     <w:pPr>
       <w:spacing w:after="120"/>
@@ -32751,6 +32790,7 @@
     <w:name w:val="List Bullet 2"/>
     <w:basedOn w:val="1"/>
     <w:unhideWhenUsed/>
+    <w:qFormat/>
     <w:uiPriority w:val="99"/>
     <w:pPr>
       <w:numPr>
@@ -32766,6 +32806,7 @@
     <w:next w:val="1"/>
     <w:semiHidden/>
     <w:unhideWhenUsed/>
+    <w:qFormat/>
     <w:uiPriority w:val="39"/>
     <w:pPr>
       <w:ind w:left="840" w:leftChars="400"/>
@@ -32776,6 +32817,7 @@
     <w:basedOn w:val="1"/>
     <w:link w:val="139"/>
     <w:unhideWhenUsed/>
+    <w:qFormat/>
     <w:uiPriority w:val="99"/>
     <w:pPr>
       <w:tabs>
@@ -32790,6 +32832,7 @@
     <w:basedOn w:val="1"/>
     <w:link w:val="138"/>
     <w:unhideWhenUsed/>
+    <w:qFormat/>
     <w:uiPriority w:val="99"/>
     <w:pPr>
       <w:tabs>
@@ -32805,6 +32848,7 @@
     <w:next w:val="1"/>
     <w:semiHidden/>
     <w:unhideWhenUsed/>
+    <w:qFormat/>
     <w:uiPriority w:val="39"/>
   </w:style>
   <w:style w:type="paragraph" w:styleId="28">
@@ -32833,6 +32877,7 @@
     <w:name w:val="List"/>
     <w:basedOn w:val="1"/>
     <w:unhideWhenUsed/>
+    <w:qFormat/>
     <w:uiPriority w:val="99"/>
     <w:pPr>
       <w:ind w:left="360" w:hanging="360"/>
@@ -32845,6 +32890,7 @@
     <w:next w:val="1"/>
     <w:semiHidden/>
     <w:unhideWhenUsed/>
+    <w:qFormat/>
     <w:uiPriority w:val="39"/>
     <w:pPr>
       <w:ind w:left="420" w:leftChars="200"/>
@@ -32855,6 +32901,7 @@
     <w:basedOn w:val="1"/>
     <w:link w:val="148"/>
     <w:unhideWhenUsed/>
+    <w:qFormat/>
     <w:uiPriority w:val="99"/>
     <w:pPr>
       <w:spacing w:after="120" w:line="480" w:lineRule="auto"/>
@@ -32864,6 +32911,7 @@
     <w:name w:val="List Continue 2"/>
     <w:basedOn w:val="1"/>
     <w:unhideWhenUsed/>
+    <w:qFormat/>
     <w:uiPriority w:val="99"/>
     <w:pPr>
       <w:spacing w:after="120"/>
@@ -32875,6 +32923,7 @@
     <w:name w:val="List Continue 3"/>
     <w:basedOn w:val="1"/>
     <w:unhideWhenUsed/>
+    <w:qFormat/>
     <w:uiPriority w:val="99"/>
     <w:pPr>
       <w:spacing w:after="120"/>
@@ -32908,6 +32957,7 @@
   <w:style w:type="table" w:styleId="36">
     <w:name w:val="Table Grid"/>
     <w:basedOn w:val="35"/>
+    <w:qFormat/>
     <w:uiPriority w:val="59"/>
     <w:pPr>
       <w:spacing w:after="0" w:line="240" w:lineRule="auto"/>
@@ -33031,6 +33081,7 @@
   <w:style w:type="table" w:styleId="38">
     <w:name w:val="Light Shading Accent 1"/>
     <w:basedOn w:val="35"/>
+    <w:qFormat/>
     <w:uiPriority w:val="60"/>
     <w:pPr>
       <w:spacing w:after="0" w:line="240" w:lineRule="auto"/>
@@ -33130,6 +33181,7 @@
   <w:style w:type="table" w:styleId="39">
     <w:name w:val="Light Shading Accent 2"/>
     <w:basedOn w:val="35"/>
+    <w:qFormat/>
     <w:uiPriority w:val="60"/>
     <w:pPr>
       <w:spacing w:after="0" w:line="240" w:lineRule="auto"/>
@@ -33229,6 +33281,7 @@
   <w:style w:type="table" w:styleId="40">
     <w:name w:val="Light Shading Accent 3"/>
     <w:basedOn w:val="35"/>
+    <w:qFormat/>
     <w:uiPriority w:val="60"/>
     <w:pPr>
       <w:spacing w:after="0" w:line="240" w:lineRule="auto"/>
@@ -33328,6 +33381,7 @@
   <w:style w:type="table" w:styleId="41">
     <w:name w:val="Light Shading Accent 4"/>
     <w:basedOn w:val="35"/>
+    <w:qFormat/>
     <w:uiPriority w:val="60"/>
     <w:pPr>
       <w:spacing w:after="0" w:line="240" w:lineRule="auto"/>
@@ -33427,6 +33481,7 @@
   <w:style w:type="table" w:styleId="42">
     <w:name w:val="Light Shading Accent 5"/>
     <w:basedOn w:val="35"/>
+    <w:qFormat/>
     <w:uiPriority w:val="60"/>
     <w:pPr>
       <w:spacing w:after="0" w:line="240" w:lineRule="auto"/>
@@ -33526,6 +33581,7 @@
   <w:style w:type="table" w:styleId="43">
     <w:name w:val="Light Shading Accent 6"/>
     <w:basedOn w:val="35"/>
+    <w:qFormat/>
     <w:uiPriority w:val="60"/>
     <w:pPr>
       <w:spacing w:after="0" w:line="240" w:lineRule="auto"/>
@@ -33625,6 +33681,7 @@
   <w:style w:type="table" w:styleId="44">
     <w:name w:val="Light List"/>
     <w:basedOn w:val="35"/>
+    <w:qFormat/>
     <w:uiPriority w:val="61"/>
     <w:pPr>
       <w:spacing w:after="0" w:line="240" w:lineRule="auto"/>
@@ -33718,6 +33775,7 @@
   <w:style w:type="table" w:styleId="45">
     <w:name w:val="Light List Accent 1"/>
     <w:basedOn w:val="35"/>
+    <w:qFormat/>
     <w:uiPriority w:val="61"/>
     <w:pPr>
       <w:spacing w:after="0" w:line="240" w:lineRule="auto"/>
@@ -33811,6 +33869,7 @@
   <w:style w:type="table" w:styleId="46">
     <w:name w:val="Light List Accent 2"/>
     <w:basedOn w:val="35"/>
+    <w:qFormat/>
     <w:uiPriority w:val="61"/>
     <w:pPr>
       <w:spacing w:after="0" w:line="240" w:lineRule="auto"/>
@@ -33904,6 +33963,7 @@
   <w:style w:type="table" w:styleId="47">
     <w:name w:val="Light List Accent 3"/>
     <w:basedOn w:val="35"/>
+    <w:qFormat/>
     <w:uiPriority w:val="61"/>
     <w:pPr>
       <w:spacing w:after="0" w:line="240" w:lineRule="auto"/>
@@ -33997,6 +34057,7 @@
   <w:style w:type="table" w:styleId="48">
     <w:name w:val="Light List Accent 4"/>
     <w:basedOn w:val="35"/>
+    <w:qFormat/>
     <w:uiPriority w:val="61"/>
     <w:pPr>
       <w:spacing w:after="0" w:line="240" w:lineRule="auto"/>
@@ -34090,6 +34151,7 @@
   <w:style w:type="table" w:styleId="49">
     <w:name w:val="Light List Accent 5"/>
     <w:basedOn w:val="35"/>
+    <w:qFormat/>
     <w:uiPriority w:val="61"/>
     <w:pPr>
       <w:spacing w:after="0" w:line="240" w:lineRule="auto"/>
@@ -34183,6 +34245,7 @@
   <w:style w:type="table" w:styleId="50">
     <w:name w:val="Light List Accent 6"/>
     <w:basedOn w:val="35"/>
+    <w:qFormat/>
     <w:uiPriority w:val="61"/>
     <w:pPr>
       <w:spacing w:after="0" w:line="240" w:lineRule="auto"/>
@@ -34276,6 +34339,7 @@
   <w:style w:type="table" w:styleId="51">
     <w:name w:val="Light Grid"/>
     <w:basedOn w:val="35"/>
+    <w:qFormat/>
     <w:uiPriority w:val="62"/>
     <w:pPr>
       <w:spacing w:after="0" w:line="240" w:lineRule="auto"/>
@@ -34402,6 +34466,7 @@
   <w:style w:type="table" w:styleId="52">
     <w:name w:val="Light Grid Accent 1"/>
     <w:basedOn w:val="35"/>
+    <w:qFormat/>
     <w:uiPriority w:val="62"/>
     <w:pPr>
       <w:spacing w:after="0" w:line="240" w:lineRule="auto"/>
@@ -34528,6 +34593,7 @@
   <w:style w:type="table" w:styleId="53">
     <w:name w:val="Light Grid Accent 2"/>
     <w:basedOn w:val="35"/>
+    <w:qFormat/>
     <w:uiPriority w:val="62"/>
     <w:pPr>
       <w:spacing w:after="0" w:line="240" w:lineRule="auto"/>
@@ -34654,6 +34720,7 @@
   <w:style w:type="table" w:styleId="54">
     <w:name w:val="Light Grid Accent 3"/>
     <w:basedOn w:val="35"/>
+    <w:qFormat/>
     <w:uiPriority w:val="62"/>
     <w:pPr>
       <w:spacing w:after="0" w:line="240" w:lineRule="auto"/>
@@ -34780,6 +34847,7 @@
   <w:style w:type="table" w:styleId="55">
     <w:name w:val="Light Grid Accent 4"/>
     <w:basedOn w:val="35"/>
+    <w:qFormat/>
     <w:uiPriority w:val="62"/>
     <w:pPr>
       <w:spacing w:after="0" w:line="240" w:lineRule="auto"/>
@@ -34906,6 +34974,7 @@
   <w:style w:type="table" w:styleId="56">
     <w:name w:val="Light Grid Accent 5"/>
     <w:basedOn w:val="35"/>
+    <w:qFormat/>
     <w:uiPriority w:val="62"/>
     <w:pPr>
       <w:spacing w:after="0" w:line="240" w:lineRule="auto"/>
@@ -35032,6 +35101,7 @@
   <w:style w:type="table" w:styleId="57">
     <w:name w:val="Light Grid Accent 6"/>
     <w:basedOn w:val="35"/>
+    <w:qFormat/>
     <w:uiPriority w:val="62"/>
     <w:pPr>
       <w:spacing w:after="0" w:line="240" w:lineRule="auto"/>
@@ -35158,6 +35228,7 @@
   <w:style w:type="table" w:styleId="58">
     <w:name w:val="Medium Shading 1"/>
     <w:basedOn w:val="35"/>
+    <w:qFormat/>
     <w:uiPriority w:val="63"/>
     <w:pPr>
       <w:spacing w:after="0" w:line="240" w:lineRule="auto"/>
@@ -35373,6 +35444,7 @@
   <w:style w:type="table" w:styleId="60">
     <w:name w:val="Medium Shading 1 Accent 2"/>
     <w:basedOn w:val="35"/>
+    <w:qFormat/>
     <w:uiPriority w:val="63"/>
     <w:pPr>
       <w:spacing w:after="0" w:line="240" w:lineRule="auto"/>
@@ -35480,6 +35552,7 @@
   <w:style w:type="table" w:styleId="61">
     <w:name w:val="Medium Shading 1 Accent 3"/>
     <w:basedOn w:val="35"/>
+    <w:qFormat/>
     <w:uiPriority w:val="63"/>
     <w:pPr>
       <w:spacing w:after="0" w:line="240" w:lineRule="auto"/>
@@ -35587,6 +35660,7 @@
   <w:style w:type="table" w:styleId="62">
     <w:name w:val="Medium Shading 1 Accent 4"/>
     <w:basedOn w:val="35"/>
+    <w:qFormat/>
     <w:uiPriority w:val="63"/>
     <w:pPr>
       <w:spacing w:after="0" w:line="240" w:lineRule="auto"/>
@@ -35694,6 +35768,7 @@
   <w:style w:type="table" w:styleId="63">
     <w:name w:val="Medium Shading 1 Accent 5"/>
     <w:basedOn w:val="35"/>
+    <w:qFormat/>
     <w:uiPriority w:val="63"/>
     <w:pPr>
       <w:spacing w:after="0" w:line="240" w:lineRule="auto"/>
@@ -35801,6 +35876,7 @@
   <w:style w:type="table" w:styleId="64">
     <w:name w:val="Medium Shading 1 Accent 6"/>
     <w:basedOn w:val="35"/>
+    <w:qFormat/>
     <w:uiPriority w:val="63"/>
     <w:pPr>
       <w:spacing w:after="0" w:line="240" w:lineRule="auto"/>
@@ -35908,6 +35984,7 @@
   <w:style w:type="table" w:styleId="65">
     <w:name w:val="Medium Shading 2"/>
     <w:basedOn w:val="35"/>
+    <w:qFormat/>
     <w:uiPriority w:val="64"/>
     <w:pPr>
       <w:spacing w:after="0" w:line="240" w:lineRule="auto"/>
@@ -36073,6 +36150,7 @@
   <w:style w:type="table" w:styleId="66">
     <w:name w:val="Medium Shading 2 Accent 1"/>
     <w:basedOn w:val="35"/>
+    <w:qFormat/>
     <w:uiPriority w:val="64"/>
     <w:pPr>
       <w:spacing w:after="0" w:line="240" w:lineRule="auto"/>
@@ -36238,6 +36316,7 @@
   <w:style w:type="table" w:styleId="67">
     <w:name w:val="Medium Shading 2 Accent 2"/>
     <w:basedOn w:val="35"/>
+    <w:qFormat/>
     <w:uiPriority w:val="64"/>
     <w:pPr>
       <w:spacing w:after="0" w:line="240" w:lineRule="auto"/>
@@ -36569,6 +36648,7 @@
   <w:style w:type="table" w:styleId="69">
     <w:name w:val="Medium Shading 2 Accent 4"/>
     <w:basedOn w:val="35"/>
+    <w:qFormat/>
     <w:uiPriority w:val="64"/>
     <w:pPr>
       <w:spacing w:after="0" w:line="240" w:lineRule="auto"/>
@@ -36734,6 +36814,7 @@
   <w:style w:type="table" w:styleId="70">
     <w:name w:val="Medium Shading 2 Accent 5"/>
     <w:basedOn w:val="35"/>
+    <w:qFormat/>
     <w:uiPriority w:val="64"/>
     <w:pPr>
       <w:spacing w:after="0" w:line="240" w:lineRule="auto"/>
@@ -37065,6 +37146,7 @@
   <w:style w:type="table" w:styleId="72">
     <w:name w:val="Medium List 1"/>
     <w:basedOn w:val="35"/>
+    <w:qFormat/>
     <w:uiPriority w:val="65"/>
     <w:pPr>
       <w:spacing w:after="0" w:line="240" w:lineRule="auto"/>
@@ -37246,6 +37328,7 @@
   <w:style w:type="table" w:styleId="74">
     <w:name w:val="Medium List 1 Accent 2"/>
     <w:basedOn w:val="35"/>
+    <w:qFormat/>
     <w:uiPriority w:val="65"/>
     <w:pPr>
       <w:spacing w:after="0" w:line="240" w:lineRule="auto"/>
@@ -37336,6 +37419,7 @@
   <w:style w:type="table" w:styleId="75">
     <w:name w:val="Medium List 1 Accent 3"/>
     <w:basedOn w:val="35"/>
+    <w:qFormat/>
     <w:uiPriority w:val="65"/>
     <w:pPr>
       <w:spacing w:after="0" w:line="240" w:lineRule="auto"/>
@@ -37426,6 +37510,7 @@
   <w:style w:type="table" w:styleId="76">
     <w:name w:val="Medium List 1 Accent 4"/>
     <w:basedOn w:val="35"/>
+    <w:qFormat/>
     <w:uiPriority w:val="65"/>
     <w:pPr>
       <w:spacing w:after="0" w:line="240" w:lineRule="auto"/>
@@ -37516,6 +37601,7 @@
   <w:style w:type="table" w:styleId="77">
     <w:name w:val="Medium List 1 Accent 5"/>
     <w:basedOn w:val="35"/>
+    <w:qFormat/>
     <w:uiPriority w:val="65"/>
     <w:pPr>
       <w:spacing w:after="0" w:line="240" w:lineRule="auto"/>
@@ -37606,6 +37692,7 @@
   <w:style w:type="table" w:styleId="78">
     <w:name w:val="Medium List 1 Accent 6"/>
     <w:basedOn w:val="35"/>
+    <w:qFormat/>
     <w:uiPriority w:val="65"/>
     <w:pPr>
       <w:spacing w:after="0" w:line="240" w:lineRule="auto"/>
@@ -37696,6 +37783,7 @@
   <w:style w:type="table" w:styleId="79">
     <w:name w:val="Medium List 2"/>
     <w:basedOn w:val="35"/>
+    <w:qFormat/>
     <w:uiPriority w:val="66"/>
     <w:pPr>
       <w:spacing w:after="0" w:line="240" w:lineRule="auto"/>
@@ -37825,6 +37913,7 @@
   <w:style w:type="table" w:styleId="80">
     <w:name w:val="Medium List 2 Accent 1"/>
     <w:basedOn w:val="35"/>
+    <w:qFormat/>
     <w:uiPriority w:val="66"/>
     <w:pPr>
       <w:spacing w:after="0" w:line="240" w:lineRule="auto"/>
@@ -37954,6 +38043,7 @@
   <w:style w:type="table" w:styleId="81">
     <w:name w:val="Medium List 2 Accent 2"/>
     <w:basedOn w:val="35"/>
+    <w:qFormat/>
     <w:uiPriority w:val="66"/>
     <w:pPr>
       <w:spacing w:after="0" w:line="240" w:lineRule="auto"/>
@@ -38083,6 +38173,7 @@
   <w:style w:type="table" w:styleId="82">
     <w:name w:val="Medium List 2 Accent 3"/>
     <w:basedOn w:val="35"/>
+    <w:qFormat/>
     <w:uiPriority w:val="66"/>
     <w:pPr>
       <w:spacing w:after="0" w:line="240" w:lineRule="auto"/>
@@ -38212,6 +38303,7 @@
   <w:style w:type="table" w:styleId="83">
     <w:name w:val="Medium List 2 Accent 4"/>
     <w:basedOn w:val="35"/>
+    <w:qFormat/>
     <w:uiPriority w:val="66"/>
     <w:pPr>
       <w:spacing w:after="0" w:line="240" w:lineRule="auto"/>
@@ -38341,6 +38433,7 @@
   <w:style w:type="table" w:styleId="84">
     <w:name w:val="Medium List 2 Accent 5"/>
     <w:basedOn w:val="35"/>
+    <w:qFormat/>
     <w:uiPriority w:val="66"/>
     <w:pPr>
       <w:spacing w:after="0" w:line="240" w:lineRule="auto"/>
@@ -38470,6 +38563,7 @@
   <w:style w:type="table" w:styleId="85">
     <w:name w:val="Medium List 2 Accent 6"/>
     <w:basedOn w:val="35"/>
+    <w:qFormat/>
     <w:uiPriority w:val="66"/>
     <w:pPr>
       <w:spacing w:after="0" w:line="240" w:lineRule="auto"/>
@@ -38599,6 +38693,7 @@
   <w:style w:type="table" w:styleId="86">
     <w:name w:val="Medium Grid 1"/>
     <w:basedOn w:val="35"/>
+    <w:qFormat/>
     <w:uiPriority w:val="67"/>
     <w:pPr>
       <w:spacing w:after="0" w:line="240" w:lineRule="auto"/>
@@ -38668,6 +38763,7 @@
   <w:style w:type="table" w:styleId="87">
     <w:name w:val="Medium Grid 1 Accent 1"/>
     <w:basedOn w:val="35"/>
+    <w:qFormat/>
     <w:uiPriority w:val="67"/>
     <w:pPr>
       <w:spacing w:after="0" w:line="240" w:lineRule="auto"/>
@@ -38737,6 +38833,7 @@
   <w:style w:type="table" w:styleId="88">
     <w:name w:val="Medium Grid 1 Accent 2"/>
     <w:basedOn w:val="35"/>
+    <w:qFormat/>
     <w:uiPriority w:val="67"/>
     <w:pPr>
       <w:spacing w:after="0" w:line="240" w:lineRule="auto"/>
@@ -38806,6 +38903,7 @@
   <w:style w:type="table" w:styleId="89">
     <w:name w:val="Medium Grid 1 Accent 3"/>
     <w:basedOn w:val="35"/>
+    <w:qFormat/>
     <w:uiPriority w:val="67"/>
     <w:pPr>
       <w:spacing w:after="0" w:line="240" w:lineRule="auto"/>
@@ -38875,6 +38973,7 @@
   <w:style w:type="table" w:styleId="90">
     <w:name w:val="Medium Grid 1 Accent 4"/>
     <w:basedOn w:val="35"/>
+    <w:qFormat/>
     <w:uiPriority w:val="67"/>
     <w:pPr>
       <w:spacing w:after="0" w:line="240" w:lineRule="auto"/>
@@ -38944,6 +39043,7 @@
   <w:style w:type="table" w:styleId="91">
     <w:name w:val="Medium Grid 1 Accent 5"/>
     <w:basedOn w:val="35"/>
+    <w:qFormat/>
     <w:uiPriority w:val="67"/>
     <w:pPr>
       <w:spacing w:after="0" w:line="240" w:lineRule="auto"/>
@@ -39013,6 +39113,7 @@
   <w:style w:type="table" w:styleId="92">
     <w:name w:val="Medium Grid 1 Accent 6"/>
     <w:basedOn w:val="35"/>
+    <w:qFormat/>
     <w:uiPriority w:val="67"/>
     <w:pPr>
       <w:spacing w:after="0" w:line="240" w:lineRule="auto"/>
@@ -39082,6 +39183,7 @@
   <w:style w:type="table" w:styleId="93">
     <w:name w:val="Medium Grid 2"/>
     <w:basedOn w:val="35"/>
+    <w:qFormat/>
     <w:uiPriority w:val="68"/>
     <w:pPr>
       <w:spacing w:after="0" w:line="240" w:lineRule="auto"/>
@@ -39228,6 +39330,7 @@
   <w:style w:type="table" w:styleId="94">
     <w:name w:val="Medium Grid 2 Accent 1"/>
     <w:basedOn w:val="35"/>
+    <w:qFormat/>
     <w:uiPriority w:val="68"/>
     <w:pPr>
       <w:spacing w:after="0" w:line="240" w:lineRule="auto"/>
@@ -39374,6 +39477,7 @@
   <w:style w:type="table" w:styleId="95">
     <w:name w:val="Medium Grid 2 Accent 2"/>
     <w:basedOn w:val="35"/>
+    <w:qFormat/>
     <w:uiPriority w:val="68"/>
     <w:pPr>
       <w:spacing w:after="0" w:line="240" w:lineRule="auto"/>
@@ -39520,6 +39624,7 @@
   <w:style w:type="table" w:styleId="96">
     <w:name w:val="Medium Grid 2 Accent 3"/>
     <w:basedOn w:val="35"/>
+    <w:qFormat/>
     <w:uiPriority w:val="68"/>
     <w:pPr>
       <w:spacing w:after="0" w:line="240" w:lineRule="auto"/>
@@ -39666,6 +39771,7 @@
   <w:style w:type="table" w:styleId="97">
     <w:name w:val="Medium Grid 2 Accent 4"/>
     <w:basedOn w:val="35"/>
+    <w:qFormat/>
     <w:uiPriority w:val="68"/>
     <w:pPr>
       <w:spacing w:after="0" w:line="240" w:lineRule="auto"/>
@@ -39812,6 +39918,7 @@
   <w:style w:type="table" w:styleId="98">
     <w:name w:val="Medium Grid 2 Accent 5"/>
     <w:basedOn w:val="35"/>
+    <w:qFormat/>
     <w:uiPriority w:val="68"/>
     <w:pPr>
       <w:spacing w:after="0" w:line="240" w:lineRule="auto"/>
@@ -39958,6 +40065,7 @@
   <w:style w:type="table" w:styleId="99">
     <w:name w:val="Medium Grid 2 Accent 6"/>
     <w:basedOn w:val="35"/>
+    <w:qFormat/>
     <w:uiPriority w:val="68"/>
     <w:pPr>
       <w:spacing w:after="0" w:line="240" w:lineRule="auto"/>
@@ -40104,6 +40212,7 @@
   <w:style w:type="table" w:styleId="100">
     <w:name w:val="Medium Grid 3"/>
     <w:basedOn w:val="35"/>
+    <w:qFormat/>
     <w:uiPriority w:val="69"/>
     <w:pPr>
       <w:spacing w:after="0" w:line="240" w:lineRule="auto"/>
@@ -40261,6 +40370,7 @@
   <w:style w:type="table" w:styleId="101">
     <w:name w:val="Medium Grid 3 Accent 1"/>
     <w:basedOn w:val="35"/>
+    <w:qFormat/>
     <w:uiPriority w:val="69"/>
     <w:pPr>
       <w:spacing w:after="0" w:line="240" w:lineRule="auto"/>
@@ -40418,6 +40528,7 @@
   <w:style w:type="table" w:styleId="102">
     <w:name w:val="Medium Grid 3 Accent 2"/>
     <w:basedOn w:val="35"/>
+    <w:qFormat/>
     <w:uiPriority w:val="69"/>
     <w:pPr>
       <w:spacing w:after="0" w:line="240" w:lineRule="auto"/>
@@ -40575,6 +40686,7 @@
   <w:style w:type="table" w:styleId="103">
     <w:name w:val="Medium Grid 3 Accent 3"/>
     <w:basedOn w:val="35"/>
+    <w:qFormat/>
     <w:uiPriority w:val="69"/>
     <w:pPr>
       <w:spacing w:after="0" w:line="240" w:lineRule="auto"/>
@@ -40732,6 +40844,7 @@
   <w:style w:type="table" w:styleId="104">
     <w:name w:val="Medium Grid 3 Accent 4"/>
     <w:basedOn w:val="35"/>
+    <w:qFormat/>
     <w:uiPriority w:val="69"/>
     <w:pPr>
       <w:spacing w:after="0" w:line="240" w:lineRule="auto"/>
@@ -40889,6 +41002,7 @@
   <w:style w:type="table" w:styleId="105">
     <w:name w:val="Medium Grid 3 Accent 5"/>
     <w:basedOn w:val="35"/>
+    <w:qFormat/>
     <w:uiPriority w:val="69"/>
     <w:pPr>
       <w:spacing w:after="0" w:line="240" w:lineRule="auto"/>
@@ -41046,6 +41160,7 @@
   <w:style w:type="table" w:styleId="106">
     <w:name w:val="Medium Grid 3 Accent 6"/>
     <w:basedOn w:val="35"/>
+    <w:qFormat/>
     <w:uiPriority w:val="69"/>
     <w:pPr>
       <w:spacing w:after="0" w:line="240" w:lineRule="auto"/>
@@ -41203,6 +41318,7 @@
   <w:style w:type="table" w:styleId="107">
     <w:name w:val="Dark List"/>
     <w:basedOn w:val="35"/>
+    <w:qFormat/>
     <w:uiPriority w:val="70"/>
     <w:pPr>
       <w:spacing w:after="0" w:line="240" w:lineRule="auto"/>
@@ -41318,6 +41434,7 @@
   <w:style w:type="table" w:styleId="108">
     <w:name w:val="Dark List Accent 1"/>
     <w:basedOn w:val="35"/>
+    <w:qFormat/>
     <w:uiPriority w:val="70"/>
     <w:pPr>
       <w:spacing w:after="0" w:line="240" w:lineRule="auto"/>
@@ -41433,6 +41550,7 @@
   <w:style w:type="table" w:styleId="109">
     <w:name w:val="Dark List Accent 2"/>
     <w:basedOn w:val="35"/>
+    <w:qFormat/>
     <w:uiPriority w:val="70"/>
     <w:pPr>
       <w:spacing w:after="0" w:line="240" w:lineRule="auto"/>
@@ -41548,6 +41666,7 @@
   <w:style w:type="table" w:styleId="110">
     <w:name w:val="Dark List Accent 3"/>
     <w:basedOn w:val="35"/>
+    <w:qFormat/>
     <w:uiPriority w:val="70"/>
     <w:pPr>
       <w:spacing w:after="0" w:line="240" w:lineRule="auto"/>
@@ -41663,6 +41782,7 @@
   <w:style w:type="table" w:styleId="111">
     <w:name w:val="Dark List Accent 4"/>
     <w:basedOn w:val="35"/>
+    <w:qFormat/>
     <w:uiPriority w:val="70"/>
     <w:pPr>
       <w:spacing w:after="0" w:line="240" w:lineRule="auto"/>
@@ -41778,6 +41898,7 @@
   <w:style w:type="table" w:styleId="112">
     <w:name w:val="Dark List Accent 5"/>
     <w:basedOn w:val="35"/>
+    <w:qFormat/>
     <w:uiPriority w:val="70"/>
     <w:pPr>
       <w:spacing w:after="0" w:line="240" w:lineRule="auto"/>
@@ -41893,6 +42014,7 @@
   <w:style w:type="table" w:styleId="113">
     <w:name w:val="Dark List Accent 6"/>
     <w:basedOn w:val="35"/>
+    <w:qFormat/>
     <w:uiPriority w:val="70"/>
     <w:pPr>
       <w:spacing w:after="0" w:line="240" w:lineRule="auto"/>
@@ -42008,6 +42130,7 @@
   <w:style w:type="table" w:styleId="114">
     <w:name w:val="Colorful Shading"/>
     <w:basedOn w:val="35"/>
+    <w:qFormat/>
     <w:uiPriority w:val="71"/>
     <w:pPr>
       <w:spacing w:after="0" w:line="240" w:lineRule="auto"/>
@@ -42156,6 +42279,7 @@
   <w:style w:type="table" w:styleId="115">
     <w:name w:val="Colorful Shading Accent 1"/>
     <w:basedOn w:val="35"/>
+    <w:qFormat/>
     <w:uiPriority w:val="71"/>
     <w:pPr>
       <w:spacing w:after="0" w:line="240" w:lineRule="auto"/>
@@ -42304,6 +42428,7 @@
   <w:style w:type="table" w:styleId="116">
     <w:name w:val="Colorful Shading Accent 2"/>
     <w:basedOn w:val="35"/>
+    <w:qFormat/>
     <w:uiPriority w:val="71"/>
     <w:pPr>
       <w:spacing w:after="0" w:line="240" w:lineRule="auto"/>
@@ -42452,6 +42577,7 @@
   <w:style w:type="table" w:styleId="117">
     <w:name w:val="Colorful Shading Accent 3"/>
     <w:basedOn w:val="35"/>
+    <w:qFormat/>
     <w:uiPriority w:val="71"/>
     <w:pPr>
       <w:spacing w:after="0" w:line="240" w:lineRule="auto"/>
@@ -42580,6 +42706,7 @@
   <w:style w:type="table" w:styleId="118">
     <w:name w:val="Colorful Shading Accent 4"/>
     <w:basedOn w:val="35"/>
+    <w:qFormat/>
     <w:uiPriority w:val="71"/>
     <w:pPr>
       <w:spacing w:after="0" w:line="240" w:lineRule="auto"/>
@@ -42728,6 +42855,7 @@
   <w:style w:type="table" w:styleId="119">
     <w:name w:val="Colorful Shading Accent 5"/>
     <w:basedOn w:val="35"/>
+    <w:qFormat/>
     <w:uiPriority w:val="71"/>
     <w:pPr>
       <w:spacing w:after="0" w:line="240" w:lineRule="auto"/>
@@ -42876,6 +43004,7 @@
   <w:style w:type="table" w:styleId="120">
     <w:name w:val="Colorful Shading Accent 6"/>
     <w:basedOn w:val="35"/>
+    <w:qFormat/>
     <w:uiPriority w:val="71"/>
     <w:pPr>
       <w:spacing w:after="0" w:line="240" w:lineRule="auto"/>
@@ -43117,6 +43246,7 @@
   <w:style w:type="table" w:styleId="122">
     <w:name w:val="Colorful List Accent 1"/>
     <w:basedOn w:val="35"/>
+    <w:qFormat/>
     <w:uiPriority w:val="72"/>
     <w:pPr>
       <w:spacing w:after="0" w:line="240" w:lineRule="auto"/>
@@ -43209,6 +43339,7 @@
   <w:style w:type="table" w:styleId="123">
     <w:name w:val="Colorful List Accent 2"/>
     <w:basedOn w:val="35"/>
+    <w:qFormat/>
     <w:uiPriority w:val="72"/>
     <w:pPr>
       <w:spacing w:after="0" w:line="240" w:lineRule="auto"/>
@@ -43301,6 +43432,7 @@
   <w:style w:type="table" w:styleId="124">
     <w:name w:val="Colorful List Accent 3"/>
     <w:basedOn w:val="35"/>
+    <w:qFormat/>
     <w:uiPriority w:val="72"/>
     <w:pPr>
       <w:spacing w:after="0" w:line="240" w:lineRule="auto"/>
@@ -43393,6 +43525,7 @@
   <w:style w:type="table" w:styleId="125">
     <w:name w:val="Colorful List Accent 4"/>
     <w:basedOn w:val="35"/>
+    <w:qFormat/>
     <w:uiPriority w:val="72"/>
     <w:pPr>
       <w:spacing w:after="0" w:line="240" w:lineRule="auto"/>
@@ -43485,6 +43618,7 @@
   <w:style w:type="table" w:styleId="126">
     <w:name w:val="Colorful List Accent 5"/>
     <w:basedOn w:val="35"/>
+    <w:qFormat/>
     <w:uiPriority w:val="72"/>
     <w:pPr>
       <w:spacing w:after="0" w:line="240" w:lineRule="auto"/>
@@ -43577,6 +43711,7 @@
   <w:style w:type="table" w:styleId="127">
     <w:name w:val="Colorful List Accent 6"/>
     <w:basedOn w:val="35"/>
+    <w:qFormat/>
     <w:uiPriority w:val="72"/>
     <w:pPr>
       <w:spacing w:after="0" w:line="240" w:lineRule="auto"/>
@@ -43669,6 +43804,7 @@
   <w:style w:type="table" w:styleId="128">
     <w:name w:val="Colorful Grid"/>
     <w:basedOn w:val="35"/>
+    <w:qFormat/>
     <w:uiPriority w:val="73"/>
     <w:pPr>
       <w:spacing w:after="0" w:line="240" w:lineRule="auto"/>
@@ -43765,6 +43901,7 @@
   <w:style w:type="table" w:styleId="129">
     <w:name w:val="Colorful Grid Accent 1"/>
     <w:basedOn w:val="35"/>
+    <w:qFormat/>
     <w:uiPriority w:val="73"/>
     <w:pPr>
       <w:spacing w:after="0" w:line="240" w:lineRule="auto"/>
@@ -43861,6 +43998,7 @@
   <w:style w:type="table" w:styleId="130">
     <w:name w:val="Colorful Grid Accent 2"/>
     <w:basedOn w:val="35"/>
+    <w:qFormat/>
     <w:uiPriority w:val="73"/>
     <w:pPr>
       <w:spacing w:after="0" w:line="240" w:lineRule="auto"/>
@@ -43957,6 +44095,7 @@
   <w:style w:type="table" w:styleId="131">
     <w:name w:val="Colorful Grid Accent 3"/>
     <w:basedOn w:val="35"/>
+    <w:qFormat/>
     <w:uiPriority w:val="73"/>
     <w:pPr>
       <w:spacing w:after="0" w:line="240" w:lineRule="auto"/>
@@ -44053,6 +44192,7 @@
   <w:style w:type="table" w:styleId="132">
     <w:name w:val="Colorful Grid Accent 4"/>
     <w:basedOn w:val="35"/>
+    <w:qFormat/>
     <w:uiPriority w:val="73"/>
     <w:pPr>
       <w:spacing w:after="0" w:line="240" w:lineRule="auto"/>
@@ -44149,6 +44289,7 @@
   <w:style w:type="table" w:styleId="133">
     <w:name w:val="Colorful Grid Accent 5"/>
     <w:basedOn w:val="35"/>
+    <w:qFormat/>
     <w:uiPriority w:val="73"/>
     <w:pPr>
       <w:spacing w:after="0" w:line="240" w:lineRule="auto"/>
@@ -44245,6 +44386,7 @@
   <w:style w:type="table" w:styleId="134">
     <w:name w:val="Colorful Grid Accent 6"/>
     <w:basedOn w:val="35"/>
+    <w:qFormat/>
     <w:uiPriority w:val="73"/>
     <w:pPr>
       <w:spacing w:after="0" w:line="240" w:lineRule="auto"/>
@@ -44362,12 +44504,14 @@
     <w:name w:val="Header Char"/>
     <w:basedOn w:val="135"/>
     <w:link w:val="26"/>
+    <w:qFormat/>
     <w:uiPriority w:val="99"/>
   </w:style>
   <w:style w:type="character" w:customStyle="1" w:styleId="139">
     <w:name w:val="Footer Char"/>
     <w:basedOn w:val="135"/>
     <w:link w:val="25"/>
+    <w:qFormat/>
     <w:uiPriority w:val="99"/>
   </w:style>
   <w:style w:type="paragraph" w:styleId="140">
@@ -44388,6 +44532,7 @@
     <w:name w:val="Heading 1 Char"/>
     <w:basedOn w:val="135"/>
     <w:link w:val="3"/>
+    <w:qFormat/>
     <w:uiPriority w:val="9"/>
     <w:rPr>
       <w:rFonts w:asciiTheme="majorHAnsi" w:hAnsiTheme="majorHAnsi" w:eastAsiaTheme="majorEastAsia" w:cstheme="majorBidi"/>
@@ -44402,6 +44547,7 @@
     <w:name w:val="Heading 2 Char"/>
     <w:basedOn w:val="135"/>
     <w:link w:val="4"/>
+    <w:qFormat/>
     <w:uiPriority w:val="9"/>
     <w:rPr>
       <w:rFonts w:asciiTheme="majorHAnsi" w:hAnsiTheme="majorHAnsi" w:eastAsiaTheme="majorEastAsia" w:cstheme="majorBidi"/>
@@ -44421,6 +44567,7 @@
     <w:name w:val="Heading 3 Char"/>
     <w:basedOn w:val="135"/>
     <w:link w:val="5"/>
+    <w:qFormat/>
     <w:uiPriority w:val="9"/>
     <w:rPr>
       <w:rFonts w:asciiTheme="majorHAnsi" w:hAnsiTheme="majorHAnsi" w:eastAsiaTheme="majorEastAsia" w:cstheme="majorBidi"/>
@@ -44438,6 +44585,7 @@
     <w:name w:val="Title Char"/>
     <w:basedOn w:val="135"/>
     <w:link w:val="34"/>
+    <w:qFormat/>
     <w:uiPriority w:val="10"/>
     <w:rPr>
       <w:rFonts w:asciiTheme="majorHAnsi" w:hAnsiTheme="majorHAnsi" w:eastAsiaTheme="majorEastAsia" w:cstheme="majorBidi"/>
@@ -44452,6 +44600,7 @@
     <w:name w:val="Subtitle Char"/>
     <w:basedOn w:val="135"/>
     <w:link w:val="28"/>
+    <w:qFormat/>
     <w:uiPriority w:val="11"/>
     <w:rPr>
       <w:rFonts w:asciiTheme="majorHAnsi" w:hAnsiTheme="majorHAnsi" w:eastAsiaTheme="majorEastAsia" w:cstheme="majorBidi"/>
@@ -44482,18 +44631,21 @@
     <w:name w:val="Body Text Char"/>
     <w:basedOn w:val="135"/>
     <w:link w:val="19"/>
+    <w:qFormat/>
     <w:uiPriority w:val="99"/>
   </w:style>
   <w:style w:type="character" w:customStyle="1" w:styleId="148">
     <w:name w:val="Body Text 2 Char"/>
     <w:basedOn w:val="135"/>
     <w:link w:val="31"/>
+    <w:qFormat/>
     <w:uiPriority w:val="99"/>
   </w:style>
   <w:style w:type="character" w:customStyle="1" w:styleId="149">
     <w:name w:val="Body Text 3 Char"/>
     <w:basedOn w:val="135"/>
     <w:link w:val="17"/>
+    <w:qFormat/>
     <w:uiPriority w:val="99"/>
     <w:rPr>
       <w:sz w:val="16"/>
@@ -44534,6 +44686,7 @@
     <w:name w:val="Quote Char"/>
     <w:basedOn w:val="135"/>
     <w:link w:val="151"/>
+    <w:qFormat/>
     <w:uiPriority w:val="29"/>
     <w:rPr>
       <w:i/>
@@ -44551,6 +44704,7 @@
     <w:basedOn w:val="135"/>
     <w:link w:val="6"/>
     <w:semiHidden/>
+    <w:qFormat/>
     <w:uiPriority w:val="9"/>
     <w:rPr>
       <w:rFonts w:asciiTheme="majorHAnsi" w:hAnsiTheme="majorHAnsi" w:eastAsiaTheme="majorEastAsia" w:cstheme="majorBidi"/>
@@ -44571,6 +44725,7 @@
     <w:basedOn w:val="135"/>
     <w:link w:val="7"/>
     <w:semiHidden/>
+    <w:qFormat/>
     <w:uiPriority w:val="9"/>
     <w:rPr>
       <w:rFonts w:asciiTheme="majorHAnsi" w:hAnsiTheme="majorHAnsi" w:eastAsiaTheme="majorEastAsia" w:cstheme="majorBidi"/>
@@ -44582,6 +44737,7 @@
     <w:basedOn w:val="135"/>
     <w:link w:val="8"/>
     <w:semiHidden/>
+    <w:qFormat/>
     <w:uiPriority w:val="9"/>
     <w:rPr>
       <w:rFonts w:asciiTheme="majorHAnsi" w:hAnsiTheme="majorHAnsi" w:eastAsiaTheme="majorEastAsia" w:cstheme="majorBidi"/>
@@ -44595,6 +44751,7 @@
     <w:basedOn w:val="135"/>
     <w:link w:val="9"/>
     <w:semiHidden/>
+    <w:qFormat/>
     <w:uiPriority w:val="9"/>
     <w:rPr>
       <w:rFonts w:asciiTheme="majorHAnsi" w:hAnsiTheme="majorHAnsi" w:eastAsiaTheme="majorEastAsia" w:cstheme="majorBidi"/>
@@ -44616,6 +44773,7 @@
     <w:basedOn w:val="135"/>
     <w:link w:val="10"/>
     <w:semiHidden/>
+    <w:qFormat/>
     <w:uiPriority w:val="9"/>
     <w:rPr>
       <w:rFonts w:asciiTheme="majorHAnsi" w:hAnsiTheme="majorHAnsi" w:eastAsiaTheme="majorEastAsia" w:cstheme="majorBidi"/>
@@ -44634,6 +44792,7 @@
     <w:basedOn w:val="135"/>
     <w:link w:val="11"/>
     <w:semiHidden/>
+    <w:qFormat/>
     <w:uiPriority w:val="9"/>
     <w:rPr>
       <w:rFonts w:asciiTheme="majorHAnsi" w:hAnsiTheme="majorHAnsi" w:eastAsiaTheme="majorEastAsia" w:cstheme="majorBidi"/>
@@ -44683,6 +44842,7 @@
     <w:name w:val="Intense Quote Char"/>
     <w:basedOn w:val="135"/>
     <w:link w:val="159"/>
+    <w:qFormat/>
     <w:uiPriority w:val="30"/>
     <w:rPr>
       <w:b/>

</xml_diff>